<commit_message>
feat: Ecosistema Socioeconomico v1.0.00 - Reemplazo de prototipo
</commit_message>
<xml_diff>
--- a/Plantillas/AD Centrales.docx
+++ b/Plantillas/AD Centrales.docx
@@ -21863,6 +21863,21 @@
       </w:pPr>
       <w:r>
         <w:t>5571588631</w:t>
+      </w:r>
+    </w:p>
+    <w:p>
+      <w:r>
+        <w:t>{{foto_rostro}}</w:t>
+      </w:r>
+    </w:p>
+    <w:p>
+      <w:r>
+        <w:t>{{foto_interior}}</w:t>
+      </w:r>
+    </w:p>
+    <w:p>
+      <w:r>
+        <w:t>{{foto_exterior}}</w:t>
       </w:r>
     </w:p>
     <w:sectPr>

</xml_diff>